<commit_message>
Upload Final report files
</commit_message>
<xml_diff>
--- a/Final Report/Report.docx
+++ b/Final Report/Report.docx
@@ -2553,16 +2553,7 @@
             <w:szCs w:val="24"/>
             <w:lang w:val="de-DE"/>
           </w:rPr>
-          <m:t>=</m:t>
-        </m:r>
-        <m:r>
-          <w:rPr>
-            <w:rFonts w:ascii="Cambria Math" w:eastAsiaTheme="minorEastAsia" w:hAnsi="Cambria Math"/>
-            <w:sz w:val="24"/>
-            <w:szCs w:val="24"/>
-            <w:lang w:val="de-DE"/>
-          </w:rPr>
-          <m:t xml:space="preserve"> </m:t>
+          <m:t xml:space="preserve">= </m:t>
         </m:r>
         <m:sSup>
           <m:sSupPr>

</xml_diff>